<commit_message>
Shorten letter to opposing counsel
Co-Authored-By: Claude Fable 5.1 <noreply@anthropic.com>

Claude-Session: https://claude.ai/code/session_01WCuMqDAdDNnwoE5t5SmxVC
</commit_message>
<xml_diff>
--- a/protection-order-extension/מכתב_לבכ_המשיב_הסדר_ליווי_מוסכם.docx
+++ b/protection-order-extension/מכתב_לבכ_המשיב_הסדר_ליווי_מוסכם.docx
@@ -210,7 +210,7 @@
           <w:u w:val="single"/>
           <w:rtl/>
         </w:rPr>
-        <w:t xml:space="preserve">תיק 1298590/5 (רחובות) - הצעה להסדר ליווי מוסכם חלף הארכת צו ההגנה</w:t>
+        <w:t xml:space="preserve">תיק 1298590/5 - הצעה להסדר ליווי מוסכם חלף הארכת צו ההגנה</w:t>
       </w:r>
     </w:p>
     <w:p>
@@ -233,7 +233,7 @@
           <w:szCs w:val="24"/>
           <w:rtl/>
         </w:rPr>
-        <w:t xml:space="preserve">בהחלטת בית הדין מיום 13.8.2026 הוארך תוקף צו ההגנה באופן זמני עד ליום </w:t>
+        <w:t xml:space="preserve">צו ההגנה הוארך זמנית עד ליום </w:t>
       </w:r>
       <w:r>
         <w:rPr>
@@ -255,53 +255,7 @@
           <w:szCs w:val="24"/>
           <w:rtl/>
         </w:rPr>
-        <w:t xml:space="preserve">, ונקבע כי ניתן להגיש בקשה נוספת החל מיום 6.9.2026.</w:t>
-      </w:r>
-    </w:p>
-    <w:p>
-      <w:pPr>
-        <w:pStyle w:val="ListParagraph"/>
-        <w:numPr>
-          <w:ilvl w:val="0"/>
-          <w:numId w:val="2"/>
-        </w:numPr>
-        <w:bidi/>
-        <w:spacing w:after="120" w:before="0" w:line="360" w:lineRule="auto"/>
-        <w:jc w:val="both"/>
-      </w:pPr>
-      <w:r>
-        <w:rPr>
-          <w:rFonts w:ascii="David" w:cs="David" w:eastAsia="David" w:hAnsi="David"/>
-          <w:b w:val="false"/>
-          <w:bCs w:val="false"/>
-          <w:sz w:val="24"/>
-          <w:szCs w:val="24"/>
-          <w:rtl/>
-        </w:rPr>
-        <w:t xml:space="preserve">מרשתי ערה לעמדת מרשך המתנגד להארכת הצו, ובראש ובראשונה לטובת הילדים ולצורך לקיים את זמני השהות ללא חיכוך. מתוך שיקולים אלה, ומבלי שיהא בכך משום ויתור על טענה כלשהי, מרשתי נכונה שלא לעתור להארכת הצו, ובלבד שיובטח מנגנון המסירה שפעל עד כה.</w:t>
-      </w:r>
-    </w:p>
-    <w:p>
-      <w:pPr>
-        <w:pStyle w:val="ListParagraph"/>
-        <w:numPr>
-          <w:ilvl w:val="0"/>
-          <w:numId w:val="2"/>
-        </w:numPr>
-        <w:bidi/>
-        <w:spacing w:after="120" w:before="0" w:line="360" w:lineRule="auto"/>
-        <w:jc w:val="both"/>
-      </w:pPr>
-      <w:r>
-        <w:rPr>
-          <w:rFonts w:ascii="David" w:cs="David" w:eastAsia="David" w:hAnsi="David"/>
-          <w:b w:val="false"/>
-          <w:bCs w:val="false"/>
-          <w:sz w:val="24"/>
-          <w:szCs w:val="24"/>
-          <w:rtl/>
-        </w:rPr>
-        <w:t xml:space="preserve">כידוע לך, לפי עדכון האפוטרופוס לדין מיום 12.8.2026, עם פקיעת הצו יופסק גם הסדר הליווי, והצדדים יידרשו להיפגש ישירות כבר במסירה הראשונה שלאחר מכן. איני סבור שמי מהצדדים מעוניין בכך בשלב זה של ההליך.</w:t>
+        <w:t xml:space="preserve">. לפי עדכון האפוטרופוס לדין מיום 12.8.2026, עם פקיעתו ייפסק גם הסדר הליווי במסירת הקטינות.</w:t>
       </w:r>
     </w:p>
     <w:p>
@@ -325,7 +279,7 @@
           <w:szCs w:val="24"/>
           <w:rtl/>
         </w:rPr>
-        <w:t xml:space="preserve">לפיכך, מוצע כדלקמן:</w:t>
+        <w:t xml:space="preserve">בהתחשב בעמדת מרשך ובטובת הילדים, ומבלי לוותר על טענה כלשהי, מרשתי נכונה שלא לעתור להארכת הצו, ובלבד שהסדר הליווי יישמר. לפיכך מוצע:</w:t>
       </w:r>
     </w:p>
     <w:p>
@@ -348,7 +302,7 @@
           <w:szCs w:val="24"/>
           <w:rtl/>
         </w:rPr>
-        <w:t xml:space="preserve">מרשתי לא תגיש בקשה להארכת צו ההגנה, והצו יפקע במועדו ביום 10.9.2026.</w:t>
+        <w:t xml:space="preserve">הצו יפקע במועדו ביום 10.9.2026.</w:t>
       </w:r>
     </w:p>
     <w:p>
@@ -371,7 +325,7 @@
           <w:szCs w:val="24"/>
           <w:rtl/>
         </w:rPr>
-        <w:t xml:space="preserve">הסדר הליווי של גורם שלישי במסירת הקטינות ובהשבתן, כפי שנהג עד כה מכוח החלטת בית הדין מיום 11.2.2026, ימשיך לחול בהסכמת הצדדים, ללא תלות בצו ההגנה, עד להחלטה אחרת של בית הדין בעניין הסדרי השהות או עד להסכמה אחרת בכתב בין הצדדים.</w:t>
+        <w:t xml:space="preserve">הסדר הליווי במסירת הקטינות ובהשבתן, כפי שנהג לפי החלטת בית הדין מיום 11.2.2026, ימשיך לחול בהסכמה, ללא תלות בצו, עד להחלטה אחרת של בית הדין או להסכמה אחרת בכתב.</w:t>
       </w:r>
     </w:p>
     <w:p>
@@ -382,29 +336,6 @@
           <w:numId w:val="2"/>
         </w:numPr>
         <w:bidi/>
-        <w:spacing w:after="60" w:before="0" w:line="360" w:lineRule="auto"/>
-        <w:jc w:val="both"/>
-      </w:pPr>
-      <w:r>
-        <w:rPr>
-          <w:rFonts w:ascii="David" w:cs="David" w:eastAsia="David" w:hAnsi="David"/>
-          <w:b w:val="false"/>
-          <w:bCs w:val="false"/>
-          <w:sz w:val="24"/>
-          <w:szCs w:val="24"/>
-          <w:rtl/>
-        </w:rPr>
-        <w:t xml:space="preserve">הצדדים יגישו לבית הדין הודעה מוסכמת בנוסח המצורף למכתב זה, ויבקשו ליתן להסכמה תוקף של החלטה, כך שהאפוטרופוס לדין והגורם המלווה יפעלו על פיה.</w:t>
-      </w:r>
-    </w:p>
-    <w:p>
-      <w:pPr>
-        <w:pStyle w:val="ListParagraph"/>
-        <w:numPr>
-          <w:ilvl w:val="1"/>
-          <w:numId w:val="2"/>
-        </w:numPr>
-        <w:bidi/>
         <w:spacing w:after="120" w:before="0" w:line="360" w:lineRule="auto"/>
         <w:jc w:val="both"/>
       </w:pPr>
@@ -417,7 +348,7 @@
           <w:szCs w:val="24"/>
           <w:rtl/>
         </w:rPr>
-        <w:t xml:space="preserve">ההסכמה אינה מהווה הודאה של מי מהצדדים בטענה כלשהי, ואינה גורעת מזכותו של כל צד לפנות לבית הדין בכל עת.</w:t>
+        <w:t xml:space="preserve">הצדדים יגישו הודעה מוסכמת בנוסח המצורף ויבקשו ליתן לה תוקף של החלטה. ההסכמה אינה הודאה ואינה גורעת מזכות מי מהצדדים לפנות לבית הדין.</w:t>
       </w:r>
     </w:p>
     <w:p>
@@ -440,7 +371,7 @@
           <w:szCs w:val="24"/>
           <w:rtl/>
         </w:rPr>
-        <w:t xml:space="preserve">הסדר זה משיג את מבוקשו של מרשך, ביטול הצו, תוך שמירה על היציבות שכל הצדדים והילדים נהנו ממנה עד כה. אודה לתשובתך עד ליום </w:t>
+        <w:t xml:space="preserve">אודה לתשובתך עד ליום </w:t>
       </w:r>
       <w:r>
         <w:rPr>
@@ -462,7 +393,7 @@
           <w:szCs w:val="24"/>
           <w:rtl/>
         </w:rPr>
-        <w:t xml:space="preserve">. בהיעדר הסכמה עד למועד זה, מרשתי שומרת על זכותה להגיש בקשה להארכת הצו בטרם פקיעתו, ומכתב זה לא ישמש כנגדה.</w:t>
+        <w:t xml:space="preserve">. בהיעדר הסכמה, מרשתי שומרת על זכותה להגיש בקשה להארכת הצו בטרם פקיעתו.</w:t>
       </w:r>
     </w:p>
     <w:p>

</xml_diff>